<commit_message>
Updated chemistry paper to explain reactions
</commit_message>
<xml_diff>
--- a/papers/_sources/rope_theory_of_chemistry.docx
+++ b/papers/_sources/rope_theory_of_chemistry.docx
@@ -3,9 +3,7 @@
 <w:document xmlns:w="http://schemas.openxmlformats.org/wordprocessingml/2006/main" xmlns:m="http://schemas.openxmlformats.org/officeDocument/2006/math" xmlns:r="http://schemas.openxmlformats.org/officeDocument/2006/relationships" xmlns:o="urn:schemas-microsoft-com:office:office" xmlns:v="urn:schemas-microsoft-com:vml" xmlns:w10="urn:schemas-microsoft-com:office:word" xmlns:a="http://schemas.openxmlformats.org/drawingml/2006/main" xmlns:pic="http://schemas.openxmlformats.org/drawingml/2006/picture" xmlns:wp="http://schemas.openxmlformats.org/drawingml/2006/wordprocessingDrawing">
   <w:body>
     <w:p>
-      <w:pPr>
-        <w:pStyle w:val="FirstParagraph"/>
-      </w:pPr>
+      <w:pPr/>
       <w:r>
         <w:rPr>
           <w:bCs/>
@@ -15,9 +13,7 @@
       </w:r>
     </w:p>
     <w:p>
-      <w:pPr>
-        <w:pStyle w:val="BodyText"/>
-      </w:pPr>
+      <w:pPr/>
       <w:r>
         <w:rPr>
           <w:bCs/>
@@ -27,9 +23,7 @@
       </w:r>
     </w:p>
     <w:p>
-      <w:pPr>
-        <w:pStyle w:val="BodyText"/>
-      </w:pPr>
+      <w:pPr/>
       <w:r>
         <w:rPr>
           <w:bCs/>
@@ -39,9 +33,7 @@
       </w:r>
     </w:p>
     <w:p>
-      <w:pPr>
-        <w:pStyle w:val="BodyText"/>
-      </w:pPr>
+      <w:pPr/>
       <w:r>
         <w:rPr>
           <w:iCs/>
@@ -51,9 +43,7 @@
       </w:r>
     </w:p>
     <w:p>
-      <w:pPr>
-        <w:pStyle w:val="BodyText"/>
-      </w:pPr>
+      <w:pPr/>
       <w:r>
         <w:rPr>
           <w:bCs/>
@@ -69,9 +59,7 @@
       </w:r>
     </w:p>
     <w:p>
-      <w:pPr>
-        <w:pStyle w:val="BodyText"/>
-      </w:pPr>
+      <w:pPr/>
       <w:r>
         <w:rPr>
           <w:bCs/>
@@ -87,17 +75,13 @@
       </w:r>
     </w:p>
     <w:p>
-      <w:pPr>
-        <w:pStyle w:val="BodyText"/>
-      </w:pPr>
+      <w:pPr/>
       <w:r>
         <w:t xml:space="preserve">Working paper — June 2026</w:t>
       </w:r>
     </w:p>
     <w:p>
-      <w:pPr>
-        <w:pStyle w:val="BodyText"/>
-      </w:pPr>
+      <w:pPr/>
       <w:r>
         <w:rPr>
           <w:bCs/>
@@ -107,9 +91,7 @@
       </w:r>
     </w:p>
     <w:p>
-      <w:pPr>
-        <w:pStyle w:val="BodyText"/>
-      </w:pPr>
+      <w:pPr/>
       <w:r>
         <w:t xml:space="preserve">We extend Gaede’s Rope Hypothesis into chemistry, systematically</w:t>
       </w:r>
@@ -319,9 +301,7 @@
       </w:r>
     </w:p>
     <w:p>
-      <w:pPr>
-        <w:pStyle w:val="BodyText"/>
-      </w:pPr>
+      <w:pPr/>
       <w:r>
         <w:rPr>
           <w:bCs/>
@@ -399,9 +379,7 @@
       </w:r>
     </w:p>
     <w:p>
-      <w:pPr>
-        <w:pStyle w:val="FirstParagraph"/>
-      </w:pPr>
+      <w:pPr/>
       <w:r>
         <w:t xml:space="preserve">The Rope Hypothesis (Gaede 2014, 2020) has been systematically</w:t>
       </w:r>
@@ -449,9 +427,7 @@
       </w:r>
     </w:p>
     <w:p>
-      <w:pPr>
-        <w:pStyle w:val="BodyText"/>
-      </w:pPr>
+      <w:pPr/>
       <w:r>
         <w:t xml:space="preserve">Chemistry is the domain where Gaede’s model requires the most</w:t>
       </w:r>
@@ -517,9 +493,7 @@
       </w:r>
     </w:p>
     <w:p>
-      <w:pPr>
-        <w:pStyle w:val="BodyText"/>
-      </w:pPr>
+      <w:pPr/>
       <w:r>
         <w:t xml:space="preserve">This paper corrects Gaede’s balloon picture, replaces it with an account</w:t>
       </w:r>
@@ -555,9 +529,7 @@
       </w:r>
     </w:p>
     <w:p>
-      <w:pPr>
-        <w:pStyle w:val="BodyText"/>
-      </w:pPr>
+      <w:pPr/>
       <w:r>
         <w:t xml:space="preserve">The key insight driving the correction: atomic orbitals in quantum</w:t>
       </w:r>
@@ -615,9 +587,7 @@
       </w:r>
     </w:p>
     <w:p>
-      <w:pPr>
-        <w:pStyle w:val="FirstParagraph"/>
-      </w:pPr>
+      <w:pPr/>
       <w:r>
         <w:t xml:space="preserve">Gaede proposes that the electron is a balloon—a spherical shell</w:t>
       </w:r>
@@ -647,9 +617,7 @@
       </w:r>
     </w:p>
     <w:p>
-      <w:pPr>
-        <w:pStyle w:val="BodyText"/>
-      </w:pPr>
+      <w:pPr/>
       <w:r>
         <w:t xml:space="preserve">This picture gets three things right:</w:t>
       </w:r>
@@ -700,9 +668,7 @@
       </w:r>
     </w:p>
     <w:p>
-      <w:pPr>
-        <w:pStyle w:val="FirstParagraph"/>
-      </w:pPr>
+      <w:pPr/>
       <w:r>
         <w:t xml:space="preserve">But it gets the following things wrong, in order of severity:</w:t>
       </w:r>
@@ -726,7 +692,6 @@
           </w:tcPr>
           <w:p>
             <w:pPr>
-              <w:pStyle w:val="Compact"/>
               <w:jc w:val="left"/>
             </w:pPr>
             <w:r>
@@ -744,7 +709,6 @@
           </w:tcPr>
           <w:p>
             <w:pPr>
-              <w:pStyle w:val="Compact"/>
               <w:jc w:val="left"/>
             </w:pPr>
             <w:r>
@@ -762,7 +726,6 @@
           </w:tcPr>
           <w:p>
             <w:pPr>
-              <w:pStyle w:val="Compact"/>
               <w:jc w:val="left"/>
             </w:pPr>
             <w:r>
@@ -782,7 +745,6 @@
           </w:tcPr>
           <w:p>
             <w:pPr>
-              <w:pStyle w:val="Compact"/>
               <w:jc w:val="left"/>
             </w:pPr>
             <w:r>
@@ -808,7 +770,6 @@
           </w:tcPr>
           <w:p>
             <w:pPr>
-              <w:pStyle w:val="Compact"/>
               <w:jc w:val="left"/>
             </w:pPr>
             <w:r>
@@ -846,7 +807,6 @@
           </w:tcPr>
           <w:p>
             <w:pPr>
-              <w:pStyle w:val="Compact"/>
               <w:jc w:val="left"/>
             </w:pPr>
             <w:r>
@@ -880,7 +840,6 @@
           </w:tcPr>
           <w:p>
             <w:pPr>
-              <w:pStyle w:val="Compact"/>
               <w:jc w:val="left"/>
             </w:pPr>
             <w:r>
@@ -900,7 +859,6 @@
           </w:tcPr>
           <w:p>
             <w:pPr>
-              <w:pStyle w:val="Compact"/>
               <w:jc w:val="left"/>
             </w:pPr>
             <w:r>
@@ -950,7 +908,6 @@
           </w:tcPr>
           <w:p>
             <w:pPr>
-              <w:pStyle w:val="Compact"/>
               <w:jc w:val="left"/>
             </w:pPr>
             <w:r>
@@ -978,7 +935,6 @@
           </w:tcPr>
           <w:p>
             <w:pPr>
-              <w:pStyle w:val="Compact"/>
               <w:jc w:val="left"/>
             </w:pPr>
             <w:r>
@@ -998,7 +954,6 @@
           </w:tcPr>
           <w:p>
             <w:pPr>
-              <w:pStyle w:val="Compact"/>
               <w:jc w:val="left"/>
             </w:pPr>
             <w:r>
@@ -1036,7 +991,6 @@
           </w:tcPr>
           <w:p>
             <w:pPr>
-              <w:pStyle w:val="Compact"/>
               <w:jc w:val="left"/>
             </w:pPr>
             <w:r>
@@ -1070,7 +1024,6 @@
           </w:tcPr>
           <w:p>
             <w:pPr>
-              <w:pStyle w:val="Compact"/>
               <w:jc w:val="left"/>
             </w:pPr>
             <w:r>
@@ -1096,7 +1049,6 @@
           </w:tcPr>
           <w:p>
             <w:pPr>
-              <w:pStyle w:val="Compact"/>
               <w:jc w:val="left"/>
             </w:pPr>
             <w:r>
@@ -1128,7 +1080,6 @@
           </w:tcPr>
           <w:p>
             <w:pPr>
-              <w:pStyle w:val="Compact"/>
               <w:jc w:val="left"/>
             </w:pPr>
             <w:r>
@@ -1162,7 +1113,6 @@
           </w:tcPr>
           <w:p>
             <w:pPr>
-              <w:pStyle w:val="Compact"/>
               <w:jc w:val="left"/>
             </w:pPr>
             <w:r>
@@ -1182,7 +1132,6 @@
           </w:tcPr>
           <w:p>
             <w:pPr>
-              <w:pStyle w:val="Compact"/>
               <w:jc w:val="left"/>
             </w:pPr>
             <w:r>
@@ -1214,7 +1163,6 @@
           </w:tcPr>
           <w:p>
             <w:pPr>
-              <w:pStyle w:val="Compact"/>
               <w:jc w:val="left"/>
             </w:pPr>
             <w:r>
@@ -1241,9 +1189,7 @@
       </w:r>
     </w:p>
     <w:p>
-      <w:pPr>
-        <w:pStyle w:val="FirstParagraph"/>
-      </w:pPr>
+      <w:pPr/>
       <w:r>
         <w:t xml:space="preserve">Despite the errors above, Gaede’s core intuition about bonding survives</w:t>
       </w:r>
@@ -1299,9 +1245,7 @@
       </w:r>
     </w:p>
     <w:p>
-      <w:pPr>
-        <w:pStyle w:val="FirstParagraph"/>
-      </w:pPr>
+      <w:pPr/>
       <w:r>
         <w:t xml:space="preserve">The hydrogen atom consists of one proton (nucleus) and one electron</w:t>
       </w:r>
@@ -1343,17 +1287,13 @@
       </w:r>
     </w:p>
     <w:p>
-      <w:pPr>
-        <w:pStyle w:val="BodyText"/>
-      </w:pPr>
+      <w:pPr/>
       <w:r>
         <w:t xml:space="preserve">[−(ℏ²/2m)∇² + V(r)] ψ = E ψ (1)</w:t>
       </w:r>
     </w:p>
     <w:p>
-      <w:pPr>
-        <w:pStyle w:val="BodyText"/>
-      </w:pPr>
+      <w:pPr/>
       <w:r>
         <w:t xml:space="preserve">where V(r) = −e²/(4πε₀r) is the Coulomb potential (the rope tension</w:t>
       </w:r>
@@ -1371,9 +1311,7 @@
       </w:r>
     </w:p>
     <w:p>
-      <w:pPr>
-        <w:pStyle w:val="BodyText"/>
-      </w:pPr>
+      <w:pPr/>
       <w:r>
         <w:t xml:space="preserve">In rope language: equation (1) is the standing wave condition for the</w:t>
       </w:r>
@@ -1426,25 +1364,19 @@
       </w:r>
     </w:p>
     <w:p>
-      <w:pPr>
-        <w:pStyle w:val="FirstParagraph"/>
-      </w:pPr>
+      <w:pPr/>
       <w:r>
         <w:t xml:space="preserve">The allowed energies of the rope modes are:</w:t>
       </w:r>
     </w:p>
     <w:p>
-      <w:pPr>
-        <w:pStyle w:val="BodyText"/>
-      </w:pPr>
+      <w:pPr/>
       <w:r>
         <w:t xml:space="preserve">Eₙ = − e⁴m / (2ℏ²(4πε₀)²n²) = −13.6 eV / n² (2)</w:t>
       </w:r>
     </w:p>
     <w:p>
-      <w:pPr>
-        <w:pStyle w:val="BodyText"/>
-      </w:pPr>
+      <w:pPr/>
       <w:r>
         <w:t xml:space="preserve">where n = 1, 2, 3, ... is the principal quantum number (the mode</w:t>
       </w:r>
@@ -1468,9 +1400,7 @@
       </w:r>
     </w:p>
     <w:p>
-      <w:pPr>
-        <w:pStyle w:val="BodyText"/>
-      </w:pPr>
+      <w:pPr/>
       <w:r>
         <w:t xml:space="preserve">In rope language: the mode number n counts how many half-wavelengths of</w:t>
       </w:r>
@@ -1516,9 +1446,7 @@
       </w:r>
     </w:p>
     <w:p>
-      <w:pPr>
-        <w:pStyle w:val="FirstParagraph"/>
-      </w:pPr>
+      <w:pPr/>
       <w:r>
         <w:t xml:space="preserve">Each energy level n contains multiple rope modes characterised by two</w:t>
       </w:r>
@@ -1555,7 +1483,6 @@
           </w:tcPr>
           <w:p>
             <w:pPr>
-              <w:pStyle w:val="Compact"/>
               <w:jc w:val="left"/>
             </w:pPr>
             <w:r>
@@ -1587,7 +1514,6 @@
           </w:tcPr>
           <w:p>
             <w:pPr>
-              <w:pStyle w:val="Compact"/>
               <w:jc w:val="left"/>
             </w:pPr>
             <w:r>
@@ -1605,7 +1531,6 @@
           </w:tcPr>
           <w:p>
             <w:pPr>
-              <w:pStyle w:val="Compact"/>
               <w:jc w:val="left"/>
             </w:pPr>
             <w:r>
@@ -1623,7 +1548,6 @@
           </w:tcPr>
           <w:p>
             <w:pPr>
-              <w:pStyle w:val="Compact"/>
               <w:jc w:val="left"/>
             </w:pPr>
             <w:r>
@@ -1643,7 +1567,6 @@
           </w:tcPr>
           <w:p>
             <w:pPr>
-              <w:pStyle w:val="Compact"/>
               <w:jc w:val="left"/>
             </w:pPr>
             <w:r>
@@ -1657,7 +1580,6 @@
           </w:tcPr>
           <w:p>
             <w:pPr>
-              <w:pStyle w:val="Compact"/>
               <w:jc w:val="left"/>
             </w:pPr>
             <w:r>
@@ -1671,7 +1593,6 @@
           </w:tcPr>
           <w:p>
             <w:pPr>
-              <w:pStyle w:val="Compact"/>
               <w:jc w:val="left"/>
             </w:pPr>
             <w:r>
@@ -1685,7 +1606,6 @@
           </w:tcPr>
           <w:p>
             <w:pPr>
-              <w:pStyle w:val="Compact"/>
               <w:jc w:val="left"/>
             </w:pPr>
             <w:r>
@@ -1719,7 +1639,6 @@
           </w:tcPr>
           <w:p>
             <w:pPr>
-              <w:pStyle w:val="Compact"/>
               <w:jc w:val="left"/>
             </w:pPr>
             <w:r>
@@ -1733,7 +1652,6 @@
           </w:tcPr>
           <w:p>
             <w:pPr>
-              <w:pStyle w:val="Compact"/>
               <w:jc w:val="left"/>
             </w:pPr>
             <w:r>
@@ -1747,7 +1665,6 @@
           </w:tcPr>
           <w:p>
             <w:pPr>
-              <w:pStyle w:val="Compact"/>
               <w:jc w:val="left"/>
             </w:pPr>
             <w:r>
@@ -1761,7 +1678,6 @@
           </w:tcPr>
           <w:p>
             <w:pPr>
-              <w:pStyle w:val="Compact"/>
               <w:jc w:val="left"/>
             </w:pPr>
             <w:r>
@@ -1789,7 +1705,6 @@
           </w:tcPr>
           <w:p>
             <w:pPr>
-              <w:pStyle w:val="Compact"/>
               <w:jc w:val="left"/>
             </w:pPr>
             <w:r>
@@ -1803,7 +1718,6 @@
           </w:tcPr>
           <w:p>
             <w:pPr>
-              <w:pStyle w:val="Compact"/>
               <w:jc w:val="left"/>
             </w:pPr>
             <w:r>
@@ -1817,7 +1731,6 @@
           </w:tcPr>
           <w:p>
             <w:pPr>
-              <w:pStyle w:val="Compact"/>
               <w:jc w:val="left"/>
             </w:pPr>
             <w:r>
@@ -1831,7 +1744,6 @@
           </w:tcPr>
           <w:p>
             <w:pPr>
-              <w:pStyle w:val="Compact"/>
               <w:jc w:val="left"/>
             </w:pPr>
             <w:r>
@@ -1859,7 +1771,6 @@
           </w:tcPr>
           <w:p>
             <w:pPr>
-              <w:pStyle w:val="Compact"/>
               <w:jc w:val="left"/>
             </w:pPr>
             <w:r>
@@ -1873,7 +1784,6 @@
           </w:tcPr>
           <w:p>
             <w:pPr>
-              <w:pStyle w:val="Compact"/>
               <w:jc w:val="left"/>
             </w:pPr>
             <w:r>
@@ -1887,7 +1797,6 @@
           </w:tcPr>
           <w:p>
             <w:pPr>
-              <w:pStyle w:val="Compact"/>
               <w:jc w:val="left"/>
             </w:pPr>
             <w:r>
@@ -1907,7 +1816,6 @@
           </w:tcPr>
           <w:p>
             <w:pPr>
-              <w:pStyle w:val="Compact"/>
               <w:jc w:val="left"/>
             </w:pPr>
             <w:r>
@@ -1929,7 +1837,6 @@
           </w:tcPr>
           <w:p>
             <w:pPr>
-              <w:pStyle w:val="Compact"/>
               <w:jc w:val="left"/>
             </w:pPr>
             <w:r>
@@ -1949,7 +1856,6 @@
           </w:tcPr>
           <w:p>
             <w:pPr>
-              <w:pStyle w:val="Compact"/>
               <w:jc w:val="left"/>
             </w:pPr>
             <w:r>
@@ -1963,7 +1869,6 @@
           </w:tcPr>
           <w:p>
             <w:pPr>
-              <w:pStyle w:val="Compact"/>
               <w:jc w:val="left"/>
             </w:pPr>
             <w:r>
@@ -1983,7 +1888,6 @@
           </w:tcPr>
           <w:p>
             <w:pPr>
-              <w:pStyle w:val="Compact"/>
               <w:jc w:val="left"/>
             </w:pPr>
             <w:r>
@@ -2006,9 +1910,7 @@
       </w:tr>
     </w:tbl>
     <w:p>
-      <w:pPr>
-        <w:pStyle w:val="BodyText"/>
-      </w:pPr>
+      <w:pPr/>
       <w:r>
         <w:t xml:space="preserve">The physical picture is exact: each orbital is a standing wave pattern</w:t>
       </w:r>
@@ -2038,9 +1940,7 @@
       </w:r>
     </w:p>
     <w:p>
-      <w:pPr>
-        <w:pStyle w:val="BodyText"/>
-      </w:pPr>
+      <w:pPr/>
       <w:r>
         <w:t xml:space="preserve">The</w:t>
       </w:r>
@@ -2102,9 +2002,7 @@
       </w:r>
     </w:p>
     <w:p>
-      <w:pPr>
-        <w:pStyle w:val="FirstParagraph"/>
-      </w:pPr>
+      <w:pPr/>
       <w:r>
         <w:t xml:space="preserve">As nuclear charge Z increases (adding protons), more electron kinks are</w:t>
       </w:r>
@@ -2154,7 +2052,6 @@
           </w:tcPr>
           <w:p>
             <w:pPr>
-              <w:pStyle w:val="Compact"/>
               <w:jc w:val="left"/>
             </w:pPr>
             <w:r>
@@ -2186,7 +2083,6 @@
           </w:tcPr>
           <w:p>
             <w:pPr>
-              <w:pStyle w:val="Compact"/>
               <w:jc w:val="left"/>
             </w:pPr>
             <w:r>
@@ -2204,7 +2100,6 @@
           </w:tcPr>
           <w:p>
             <w:pPr>
-              <w:pStyle w:val="Compact"/>
               <w:jc w:val="left"/>
             </w:pPr>
             <w:r>
@@ -2236,7 +2131,6 @@
           </w:tcPr>
           <w:p>
             <w:pPr>
-              <w:pStyle w:val="Compact"/>
               <w:jc w:val="left"/>
             </w:pPr>
             <w:r>
@@ -2268,7 +2162,6 @@
           </w:tcPr>
           <w:p>
             <w:pPr>
-              <w:pStyle w:val="Compact"/>
               <w:jc w:val="left"/>
             </w:pPr>
             <w:r>
@@ -2302,7 +2195,6 @@
           </w:tcPr>
           <w:p>
             <w:pPr>
-              <w:pStyle w:val="Compact"/>
               <w:jc w:val="left"/>
             </w:pPr>
             <w:r>
@@ -2316,7 +2208,6 @@
           </w:tcPr>
           <w:p>
             <w:pPr>
-              <w:pStyle w:val="Compact"/>
               <w:jc w:val="left"/>
             </w:pPr>
             <w:r>
@@ -2330,7 +2221,6 @@
           </w:tcPr>
           <w:p>
             <w:pPr>
-              <w:pStyle w:val="Compact"/>
               <w:jc w:val="left"/>
             </w:pPr>
             <w:r>
@@ -2344,7 +2234,6 @@
           </w:tcPr>
           <w:p>
             <w:pPr>
-              <w:pStyle w:val="Compact"/>
               <w:jc w:val="left"/>
             </w:pPr>
             <w:r>
@@ -2358,7 +2247,6 @@
           </w:tcPr>
           <w:p>
             <w:pPr>
-              <w:pStyle w:val="Compact"/>
               <w:jc w:val="left"/>
             </w:pPr>
             <w:r>
@@ -2374,7 +2262,6 @@
           </w:tcPr>
           <w:p>
             <w:pPr>
-              <w:pStyle w:val="Compact"/>
               <w:jc w:val="left"/>
             </w:pPr>
             <w:r>
@@ -2388,7 +2275,6 @@
           </w:tcPr>
           <w:p>
             <w:pPr>
-              <w:pStyle w:val="Compact"/>
               <w:jc w:val="left"/>
             </w:pPr>
             <w:r>
@@ -2402,7 +2288,6 @@
           </w:tcPr>
           <w:p>
             <w:pPr>
-              <w:pStyle w:val="Compact"/>
               <w:jc w:val="left"/>
             </w:pPr>
             <w:r>
@@ -2416,7 +2301,6 @@
           </w:tcPr>
           <w:p>
             <w:pPr>
-              <w:pStyle w:val="Compact"/>
               <w:jc w:val="left"/>
             </w:pPr>
             <w:r>
@@ -2430,7 +2314,6 @@
           </w:tcPr>
           <w:p>
             <w:pPr>
-              <w:pStyle w:val="Compact"/>
               <w:jc w:val="left"/>
             </w:pPr>
             <w:r>
@@ -2446,7 +2329,6 @@
           </w:tcPr>
           <w:p>
             <w:pPr>
-              <w:pStyle w:val="Compact"/>
               <w:jc w:val="left"/>
             </w:pPr>
             <w:r>
@@ -2460,7 +2342,6 @@
           </w:tcPr>
           <w:p>
             <w:pPr>
-              <w:pStyle w:val="Compact"/>
               <w:jc w:val="left"/>
             </w:pPr>
             <w:r>
@@ -2474,7 +2355,6 @@
           </w:tcPr>
           <w:p>
             <w:pPr>
-              <w:pStyle w:val="Compact"/>
               <w:jc w:val="left"/>
             </w:pPr>
             <w:r>
@@ -2488,7 +2368,6 @@
           </w:tcPr>
           <w:p>
             <w:pPr>
-              <w:pStyle w:val="Compact"/>
               <w:jc w:val="left"/>
             </w:pPr>
             <w:r>
@@ -2508,7 +2387,6 @@
           </w:tcPr>
           <w:p>
             <w:pPr>
-              <w:pStyle w:val="Compact"/>
               <w:jc w:val="left"/>
             </w:pPr>
             <w:r>
@@ -2524,7 +2402,6 @@
           </w:tcPr>
           <w:p>
             <w:pPr>
-              <w:pStyle w:val="Compact"/>
               <w:jc w:val="left"/>
             </w:pPr>
             <w:r>
@@ -2538,7 +2415,6 @@
           </w:tcPr>
           <w:p>
             <w:pPr>
-              <w:pStyle w:val="Compact"/>
               <w:jc w:val="left"/>
             </w:pPr>
             <w:r>
@@ -2552,7 +2428,6 @@
           </w:tcPr>
           <w:p>
             <w:pPr>
-              <w:pStyle w:val="Compact"/>
               <w:jc w:val="left"/>
             </w:pPr>
             <w:r>
@@ -2566,7 +2441,6 @@
           </w:tcPr>
           <w:p>
             <w:pPr>
-              <w:pStyle w:val="Compact"/>
               <w:jc w:val="left"/>
             </w:pPr>
             <w:r>
@@ -2592,7 +2466,6 @@
           </w:tcPr>
           <w:p>
             <w:pPr>
-              <w:pStyle w:val="Compact"/>
               <w:jc w:val="left"/>
             </w:pPr>
             <w:r>
@@ -2608,7 +2481,6 @@
           </w:tcPr>
           <w:p>
             <w:pPr>
-              <w:pStyle w:val="Compact"/>
               <w:jc w:val="left"/>
             </w:pPr>
             <w:r>
@@ -2622,7 +2494,6 @@
           </w:tcPr>
           <w:p>
             <w:pPr>
-              <w:pStyle w:val="Compact"/>
               <w:jc w:val="left"/>
             </w:pPr>
             <w:r>
@@ -2636,7 +2507,6 @@
           </w:tcPr>
           <w:p>
             <w:pPr>
-              <w:pStyle w:val="Compact"/>
               <w:jc w:val="left"/>
             </w:pPr>
             <w:r>
@@ -2650,7 +2520,6 @@
           </w:tcPr>
           <w:p>
             <w:pPr>
-              <w:pStyle w:val="Compact"/>
               <w:jc w:val="left"/>
             </w:pPr>
             <w:r>
@@ -2670,7 +2539,6 @@
           </w:tcPr>
           <w:p>
             <w:pPr>
-              <w:pStyle w:val="Compact"/>
               <w:jc w:val="left"/>
             </w:pPr>
             <w:r>
@@ -2681,9 +2549,7 @@
       </w:tr>
     </w:tbl>
     <w:p>
-      <w:pPr>
-        <w:pStyle w:val="BodyText"/>
-      </w:pPr>
+      <w:pPr/>
       <w:r>
         <w:t xml:space="preserve">The pattern 2, 8, 8, 18, 18, 32 for shell capacities follows from the</w:t>
       </w:r>
@@ -2729,9 +2595,7 @@
       </w:r>
     </w:p>
     <w:p>
-      <w:pPr>
-        <w:pStyle w:val="FirstParagraph"/>
-      </w:pPr>
+      <w:pPr/>
       <w:r>
         <w:t xml:space="preserve">An atom’s valence — how many bonds it forms — is the number of</w:t>
       </w:r>
@@ -2775,7 +2639,6 @@
           </w:tcPr>
           <w:p>
             <w:pPr>
-              <w:pStyle w:val="Compact"/>
               <w:jc w:val="left"/>
             </w:pPr>
             <w:r>
@@ -2793,7 +2656,6 @@
           </w:tcPr>
           <w:p>
             <w:pPr>
-              <w:pStyle w:val="Compact"/>
               <w:jc w:val="left"/>
             </w:pPr>
             <w:r>
@@ -2811,7 +2673,6 @@
           </w:tcPr>
           <w:p>
             <w:pPr>
-              <w:pStyle w:val="Compact"/>
               <w:jc w:val="left"/>
             </w:pPr>
             <w:r>
@@ -2843,7 +2704,6 @@
           </w:tcPr>
           <w:p>
             <w:pPr>
-              <w:pStyle w:val="Compact"/>
               <w:jc w:val="left"/>
             </w:pPr>
             <w:r>
@@ -2861,7 +2721,6 @@
           </w:tcPr>
           <w:p>
             <w:pPr>
-              <w:pStyle w:val="Compact"/>
               <w:jc w:val="left"/>
             </w:pPr>
             <w:r>
@@ -2895,7 +2754,6 @@
           </w:tcPr>
           <w:p>
             <w:pPr>
-              <w:pStyle w:val="Compact"/>
               <w:jc w:val="left"/>
             </w:pPr>
             <w:r>
@@ -2909,7 +2767,6 @@
           </w:tcPr>
           <w:p>
             <w:pPr>
-              <w:pStyle w:val="Compact"/>
               <w:jc w:val="left"/>
             </w:pPr>
             <w:r>
@@ -2923,7 +2780,6 @@
           </w:tcPr>
           <w:p>
             <w:pPr>
-              <w:pStyle w:val="Compact"/>
               <w:jc w:val="left"/>
             </w:pPr>
             <w:r>
@@ -2937,7 +2793,6 @@
           </w:tcPr>
           <w:p>
             <w:pPr>
-              <w:pStyle w:val="Compact"/>
               <w:jc w:val="left"/>
             </w:pPr>
             <w:r>
@@ -2951,7 +2806,6 @@
           </w:tcPr>
           <w:p>
             <w:pPr>
-              <w:pStyle w:val="Compact"/>
               <w:jc w:val="left"/>
             </w:pPr>
             <w:r>
@@ -2967,7 +2821,6 @@
           </w:tcPr>
           <w:p>
             <w:pPr>
-              <w:pStyle w:val="Compact"/>
               <w:jc w:val="left"/>
             </w:pPr>
             <w:r>
@@ -2981,7 +2834,6 @@
           </w:tcPr>
           <w:p>
             <w:pPr>
-              <w:pStyle w:val="Compact"/>
               <w:jc w:val="left"/>
             </w:pPr>
             <w:r>
@@ -2995,7 +2847,6 @@
           </w:tcPr>
           <w:p>
             <w:pPr>
-              <w:pStyle w:val="Compact"/>
               <w:jc w:val="left"/>
             </w:pPr>
             <w:r>
@@ -3015,7 +2866,6 @@
           </w:tcPr>
           <w:p>
             <w:pPr>
-              <w:pStyle w:val="Compact"/>
               <w:jc w:val="left"/>
             </w:pPr>
             <w:r>
@@ -3029,7 +2879,6 @@
           </w:tcPr>
           <w:p>
             <w:pPr>
-              <w:pStyle w:val="Compact"/>
               <w:jc w:val="left"/>
             </w:pPr>
             <w:r>
@@ -3051,7 +2900,6 @@
           </w:tcPr>
           <w:p>
             <w:pPr>
-              <w:pStyle w:val="Compact"/>
               <w:jc w:val="left"/>
             </w:pPr>
             <w:r>
@@ -3065,7 +2913,6 @@
           </w:tcPr>
           <w:p>
             <w:pPr>
-              <w:pStyle w:val="Compact"/>
               <w:jc w:val="left"/>
             </w:pPr>
             <w:r>
@@ -3079,7 +2926,6 @@
           </w:tcPr>
           <w:p>
             <w:pPr>
-              <w:pStyle w:val="Compact"/>
               <w:jc w:val="left"/>
             </w:pPr>
             <w:r>
@@ -3093,7 +2939,6 @@
           </w:tcPr>
           <w:p>
             <w:pPr>
-              <w:pStyle w:val="Compact"/>
               <w:jc w:val="left"/>
             </w:pPr>
             <w:r>
@@ -3107,7 +2952,6 @@
           </w:tcPr>
           <w:p>
             <w:pPr>
-              <w:pStyle w:val="Compact"/>
               <w:jc w:val="left"/>
             </w:pPr>
             <w:r>
@@ -3123,7 +2967,6 @@
           </w:tcPr>
           <w:p>
             <w:pPr>
-              <w:pStyle w:val="Compact"/>
               <w:jc w:val="left"/>
             </w:pPr>
             <w:r>
@@ -3137,7 +2980,6 @@
           </w:tcPr>
           <w:p>
             <w:pPr>
-              <w:pStyle w:val="Compact"/>
               <w:jc w:val="left"/>
             </w:pPr>
             <w:r>
@@ -3151,7 +2993,6 @@
           </w:tcPr>
           <w:p>
             <w:pPr>
-              <w:pStyle w:val="Compact"/>
               <w:jc w:val="left"/>
             </w:pPr>
             <w:r>
@@ -3165,7 +3006,6 @@
           </w:tcPr>
           <w:p>
             <w:pPr>
-              <w:pStyle w:val="Compact"/>
               <w:jc w:val="left"/>
             </w:pPr>
             <w:r>
@@ -3179,7 +3019,6 @@
           </w:tcPr>
           <w:p>
             <w:pPr>
-              <w:pStyle w:val="Compact"/>
               <w:jc w:val="left"/>
             </w:pPr>
             <w:r>
@@ -3195,7 +3034,6 @@
           </w:tcPr>
           <w:p>
             <w:pPr>
-              <w:pStyle w:val="Compact"/>
               <w:jc w:val="left"/>
             </w:pPr>
             <w:r>
@@ -3209,7 +3047,6 @@
           </w:tcPr>
           <w:p>
             <w:pPr>
-              <w:pStyle w:val="Compact"/>
               <w:jc w:val="left"/>
             </w:pPr>
             <w:r>
@@ -3223,7 +3060,6 @@
           </w:tcPr>
           <w:p>
             <w:pPr>
-              <w:pStyle w:val="Compact"/>
               <w:jc w:val="left"/>
             </w:pPr>
             <w:r>
@@ -3237,7 +3073,6 @@
           </w:tcPr>
           <w:p>
             <w:pPr>
-              <w:pStyle w:val="Compact"/>
               <w:jc w:val="left"/>
             </w:pPr>
             <w:r>
@@ -3251,7 +3086,6 @@
           </w:tcPr>
           <w:p>
             <w:pPr>
-              <w:pStyle w:val="Compact"/>
               <w:jc w:val="left"/>
             </w:pPr>
             <w:r>
@@ -3267,7 +3101,6 @@
           </w:tcPr>
           <w:p>
             <w:pPr>
-              <w:pStyle w:val="Compact"/>
               <w:jc w:val="left"/>
             </w:pPr>
             <w:r>
@@ -3281,7 +3114,6 @@
           </w:tcPr>
           <w:p>
             <w:pPr>
-              <w:pStyle w:val="Compact"/>
               <w:jc w:val="left"/>
             </w:pPr>
             <w:r>
@@ -3295,7 +3127,6 @@
           </w:tcPr>
           <w:p>
             <w:pPr>
-              <w:pStyle w:val="Compact"/>
               <w:jc w:val="left"/>
             </w:pPr>
             <w:r>
@@ -3315,7 +3146,6 @@
           </w:tcPr>
           <w:p>
             <w:pPr>
-              <w:pStyle w:val="Compact"/>
               <w:jc w:val="left"/>
             </w:pPr>
             <w:r>
@@ -3329,7 +3159,6 @@
           </w:tcPr>
           <w:p>
             <w:pPr>
-              <w:pStyle w:val="Compact"/>
               <w:jc w:val="left"/>
             </w:pPr>
             <w:r>
@@ -3346,9 +3175,7 @@
       </w:tr>
     </w:tbl>
     <w:p>
-      <w:pPr>
-        <w:pStyle w:val="BodyText"/>
-      </w:pPr>
+      <w:pPr/>
       <w:r>
         <w:t xml:space="preserve">Noble gases (He, Ne, Ar, Kr) have all rope modes fully occupied. There</w:t>
       </w:r>
@@ -3389,9 +3216,7 @@
       </w:r>
     </w:p>
     <w:p>
-      <w:pPr>
-        <w:pStyle w:val="FirstParagraph"/>
-      </w:pPr>
+      <w:pPr/>
       <w:r>
         <w:t xml:space="preserve">Ionic bonding is the cleanest translation from rope electricity into</w:t>
       </w:r>
@@ -3418,9 +3243,7 @@
       </w:r>
     </w:p>
     <w:p>
-      <w:pPr>
-        <w:pStyle w:val="FirstParagraph"/>
-      </w:pPr>
+      <w:pPr/>
       <w:r>
         <w:t xml:space="preserve">Sodium (Na, Z=11) has configuration 1s² 2s² 2p⁶ 3s¹: one kink in a lone</w:t>
       </w:r>
@@ -3444,9 +3267,7 @@
       </w:r>
     </w:p>
     <w:p>
-      <w:pPr>
-        <w:pStyle w:val="BodyText"/>
-      </w:pPr>
+      <w:pPr/>
       <w:r>
         <w:t xml:space="preserve">When Na and Cl approach:</w:t>
       </w:r>
@@ -3520,9 +3341,7 @@
       </w:r>
     </w:p>
     <w:p>
-      <w:pPr>
-        <w:pStyle w:val="FirstParagraph"/>
-      </w:pPr>
+      <w:pPr/>
       <w:r>
         <w:t>In rope language: the ionic bond is a sustained tension gradient between Na⁺ and Cl⁻. No shared mode. No shared kink. Just a tension gradient between two ions with opposite Tᵏᵉᵗ signs, The sign of this attraction is a derived theorem, not an inherited rule: because winding is a constraint source rather than a coupling (a fact about how the strands are tied, imposed on the network), opposite twist fields cancel in the region between two ions and the pair is drawn together, while like imbalances add and repel, reproducing the Coulomb form with its sign and nothing put in by hand. This closes what had been the one unproven step in the ionic account.</w:t>
       </w:r>
@@ -3538,9 +3357,7 @@
       </w:r>
     </w:p>
     <w:p>
-      <w:pPr>
-        <w:pStyle w:val="FirstParagraph"/>
-      </w:pPr>
+      <w:pPr/>
       <w:r>
         <w:t xml:space="preserve">In NaCl solid, each Na⁺ is surrounded by six Cl⁻ ions and vice versa. In</w:t>
       </w:r>
@@ -3608,9 +3425,7 @@
       </w:r>
     </w:p>
     <w:p>
-      <w:pPr>
-        <w:pStyle w:val="FirstParagraph"/>
-      </w:pPr>
+      <w:pPr/>
       <w:r>
         <w:t xml:space="preserve">When two atoms approach each other, their rope modes begin to overlap in</w:t>
       </w:r>
@@ -3695,9 +3510,7 @@
       </w:r>
     </w:p>
     <w:p>
-      <w:pPr>
-        <w:pStyle w:val="FirstParagraph"/>
-      </w:pPr>
+      <w:pPr/>
       <w:r>
         <w:t xml:space="preserve">Bond forms when: bonding mode is occupied by (at most) two kinks, and</w:t>
       </w:r>
@@ -3725,9 +3538,7 @@
       </w:r>
     </w:p>
     <w:p>
-      <w:pPr>
-        <w:pStyle w:val="FirstParagraph"/>
-      </w:pPr>
+      <w:pPr/>
       <w:r>
         <w:t xml:space="preserve">Two hydrogen atoms, each with one kink in a 1s rope mode, approach each</w:t>
       </w:r>
@@ -3739,17 +3550,13 @@
       </w:r>
     </w:p>
     <w:p>
-      <w:pPr>
-        <w:pStyle w:val="BodyText"/>
-      </w:pPr>
+      <w:pPr/>
       <w:r>
         <w:t xml:space="preserve">E_bond = E_bonding_mode − 2 E_1s = −436 kJ mol⁻¹ (3)</w:t>
       </w:r>
     </w:p>
     <w:p>
-      <w:pPr>
-        <w:pStyle w:val="BodyText"/>
-      </w:pPr>
+      <w:pPr/>
       <w:r>
         <w:t xml:space="preserve">The bonding mode has the rope network concentrated between the nuclei</w:t>
       </w:r>
@@ -3789,9 +3596,7 @@
       </w:r>
     </w:p>
     <w:p>
-      <w:pPr>
-        <w:pStyle w:val="FirstParagraph"/>
-      </w:pPr>
+      <w:pPr/>
       <w:r>
         <w:t xml:space="preserve">Multiple bonds arise from multiple overlapping mode pairs. Each pair of</w:t>
       </w:r>
@@ -3822,7 +3627,6 @@
           </w:tcPr>
           <w:p>
             <w:pPr>
-              <w:pStyle w:val="Compact"/>
               <w:jc w:val="left"/>
             </w:pPr>
             <w:r>
@@ -3840,7 +3644,6 @@
           </w:tcPr>
           <w:p>
             <w:pPr>
-              <w:pStyle w:val="Compact"/>
               <w:jc w:val="left"/>
             </w:pPr>
             <w:r>
@@ -3872,7 +3675,6 @@
           </w:tcPr>
           <w:p>
             <w:pPr>
-              <w:pStyle w:val="Compact"/>
               <w:jc w:val="left"/>
             </w:pPr>
             <w:r>
@@ -3904,7 +3706,6 @@
           </w:tcPr>
           <w:p>
             <w:pPr>
-              <w:pStyle w:val="Compact"/>
               <w:jc w:val="left"/>
             </w:pPr>
             <w:r>
@@ -3938,7 +3739,6 @@
           </w:tcPr>
           <w:p>
             <w:pPr>
-              <w:pStyle w:val="Compact"/>
               <w:jc w:val="left"/>
             </w:pPr>
             <w:r>
@@ -3952,7 +3752,6 @@
           </w:tcPr>
           <w:p>
             <w:pPr>
-              <w:pStyle w:val="Compact"/>
               <w:jc w:val="left"/>
             </w:pPr>
             <w:r>
@@ -3978,7 +3777,6 @@
           </w:tcPr>
           <w:p>
             <w:pPr>
-              <w:pStyle w:val="Compact"/>
               <w:jc w:val="left"/>
             </w:pPr>
             <w:r>
@@ -3992,7 +3790,6 @@
           </w:tcPr>
           <w:p>
             <w:pPr>
-              <w:pStyle w:val="Compact"/>
               <w:jc w:val="left"/>
             </w:pPr>
             <w:r>
@@ -4026,7 +3823,6 @@
           </w:tcPr>
           <w:p>
             <w:pPr>
-              <w:pStyle w:val="Compact"/>
               <w:jc w:val="left"/>
             </w:pPr>
             <w:r>
@@ -4046,7 +3842,6 @@
           </w:tcPr>
           <w:p>
             <w:pPr>
-              <w:pStyle w:val="Compact"/>
               <w:jc w:val="left"/>
             </w:pPr>
             <w:r>
@@ -4066,7 +3861,6 @@
           </w:tcPr>
           <w:p>
             <w:pPr>
-              <w:pStyle w:val="Compact"/>
               <w:jc w:val="left"/>
             </w:pPr>
             <w:r>
@@ -4080,7 +3874,6 @@
           </w:tcPr>
           <w:p>
             <w:pPr>
-              <w:pStyle w:val="Compact"/>
               <w:jc w:val="left"/>
             </w:pPr>
             <w:r>
@@ -4108,7 +3901,6 @@
           </w:tcPr>
           <w:p>
             <w:pPr>
-              <w:pStyle w:val="Compact"/>
               <w:jc w:val="left"/>
             </w:pPr>
             <w:r>
@@ -4128,7 +3920,6 @@
           </w:tcPr>
           <w:p>
             <w:pPr>
-              <w:pStyle w:val="Compact"/>
               <w:jc w:val="left"/>
             </w:pPr>
             <w:r>
@@ -4148,7 +3939,6 @@
           </w:tcPr>
           <w:p>
             <w:pPr>
-              <w:pStyle w:val="Compact"/>
               <w:jc w:val="left"/>
             </w:pPr>
             <w:r>
@@ -4162,7 +3952,6 @@
           </w:tcPr>
           <w:p>
             <w:pPr>
-              <w:pStyle w:val="Compact"/>
               <w:jc w:val="left"/>
             </w:pPr>
             <w:r>
@@ -4185,9 +3974,7 @@
       </w:tr>
     </w:tbl>
     <w:p>
-      <w:pPr>
-        <w:pStyle w:val="BodyText"/>
-      </w:pPr>
+      <w:pPr/>
       <w:r>
         <w:t xml:space="preserve">The trend is physically intuitive in rope language: more overlapping</w:t>
       </w:r>
@@ -4227,9 +4014,7 @@
       </w:r>
     </w:p>
     <w:p>
-      <w:pPr>
-        <w:pStyle w:val="FirstParagraph"/>
-      </w:pPr>
+      <w:pPr/>
       <w:r>
         <w:t xml:space="preserve">The σ bond arises from head-on mode overlap (along the bond axis). The π</w:t>
       </w:r>
@@ -4247,9 +4032,7 @@
       </w:r>
     </w:p>
     <w:p>
-      <w:pPr>
-        <w:pStyle w:val="BodyText"/>
-      </w:pPr>
+      <w:pPr/>
       <w:r>
         <w:t xml:space="preserve">In rope language:</w:t>
       </w:r>
@@ -4295,9 +4078,7 @@
       </w:r>
     </w:p>
     <w:p>
-      <w:pPr>
-        <w:pStyle w:val="FirstParagraph"/>
-      </w:pPr>
+      <w:pPr/>
       <w:r>
         <w:t xml:space="preserve">π bonds are weaker than σ bonds (π component of C=C contributes ≈267 kJ</w:t>
       </w:r>
@@ -4341,9 +4122,7 @@
       </w:r>
     </w:p>
     <w:p>
-      <w:pPr>
-        <w:pStyle w:val="FirstParagraph"/>
-      </w:pPr>
+      <w:pPr/>
       <w:r>
         <w:t xml:space="preserve">In Gaede’s original picture, bonds are ropes and ropes are flexible —</w:t>
       </w:r>
@@ -4367,9 +4146,7 @@
       </w:r>
     </w:p>
     <w:p>
-      <w:pPr>
-        <w:pStyle w:val="BodyText"/>
-      </w:pPr>
+      <w:pPr/>
       <w:r>
         <w:t xml:space="preserve">The key: when an atom forms bonds, its valence rope modes mix</w:t>
       </w:r>
@@ -4397,9 +4174,7 @@
       </w:r>
     </w:p>
     <w:p>
-      <w:pPr>
-        <w:pStyle w:val="FirstParagraph"/>
-      </w:pPr>
+      <w:pPr/>
       <w:r>
         <w:t xml:space="preserve">Carbon has configuration 1s² 2s² 2p², but in CH₄ it forms four</w:t>
       </w:r>
@@ -4423,9 +4198,7 @@
       </w:r>
     </w:p>
     <w:p>
-      <w:pPr>
-        <w:pStyle w:val="BodyText"/>
-      </w:pPr>
+      <w:pPr/>
       <w:r>
         <w:t xml:space="preserve">In rope language: the spherical 2s mode and the three orthogonal 2p</w:t>
       </w:r>
@@ -4461,9 +4234,7 @@
       </w:r>
     </w:p>
     <w:p>
-      <w:pPr>
-        <w:pStyle w:val="BodyText"/>
-      </w:pPr>
+      <w:pPr/>
       <w:r>
         <w:t xml:space="preserve">Water (H₂O) also has sp³ hybridised oxygen: four sp³ modes, two occupied</w:t>
       </w:r>
@@ -4509,9 +4280,7 @@
       </w:r>
     </w:p>
     <w:p>
-      <w:pPr>
-        <w:pStyle w:val="FirstParagraph"/>
-      </w:pPr>
+      <w:pPr/>
       <w:r>
         <w:t xml:space="preserve">The 2s and two 2p modes mix to form three equivalent sp² modes at 120°</w:t>
       </w:r>
@@ -4535,9 +4304,7 @@
       </w:r>
     </w:p>
     <w:p>
-      <w:pPr>
-        <w:pStyle w:val="BodyText"/>
-      </w:pPr>
+      <w:pPr/>
       <w:r>
         <w:t xml:space="preserve">In rope language: the planar sp² modes concentrate rope network in the</w:t>
       </w:r>
@@ -4565,9 +4332,7 @@
       </w:r>
     </w:p>
     <w:p>
-      <w:pPr>
-        <w:pStyle w:val="FirstParagraph"/>
-      </w:pPr>
+      <w:pPr/>
       <w:r>
         <w:t xml:space="preserve">The 2s and one 2p mode mix to give two linear sp modes at 180°, leaving</w:t>
       </w:r>
@@ -4591,9 +4356,7 @@
       </w:r>
     </w:p>
     <w:p>
-      <w:pPr>
-        <w:pStyle w:val="BodyText"/>
-      </w:pPr>
+      <w:pPr/>
       <w:r>
         <w:t xml:space="preserve">CO₂ is linear (O=C=O at 180°) because carbon’s sp modes point in exactly</w:t>
       </w:r>
@@ -4625,7 +4388,6 @@
           </w:tcPr>
           <w:p>
             <w:pPr>
-              <w:pStyle w:val="Compact"/>
               <w:jc w:val="left"/>
             </w:pPr>
             <w:r>
@@ -4643,7 +4405,6 @@
           </w:tcPr>
           <w:p>
             <w:pPr>
-              <w:pStyle w:val="Compact"/>
               <w:jc w:val="left"/>
             </w:pPr>
             <w:r>
@@ -4661,7 +4422,6 @@
           </w:tcPr>
           <w:p>
             <w:pPr>
-              <w:pStyle w:val="Compact"/>
               <w:jc w:val="left"/>
             </w:pPr>
             <w:r>
@@ -4679,7 +4439,6 @@
           </w:tcPr>
           <w:p>
             <w:pPr>
-              <w:pStyle w:val="Compact"/>
               <w:jc w:val="left"/>
             </w:pPr>
             <w:r>
@@ -4711,7 +4470,6 @@
           </w:tcPr>
           <w:p>
             <w:pPr>
-              <w:pStyle w:val="Compact"/>
               <w:jc w:val="left"/>
             </w:pPr>
             <w:r>
@@ -4731,7 +4489,6 @@
           </w:tcPr>
           <w:p>
             <w:pPr>
-              <w:pStyle w:val="Compact"/>
               <w:jc w:val="left"/>
             </w:pPr>
             <w:r>
@@ -4745,7 +4502,6 @@
           </w:tcPr>
           <w:p>
             <w:pPr>
-              <w:pStyle w:val="Compact"/>
               <w:jc w:val="left"/>
             </w:pPr>
             <w:r>
@@ -4765,7 +4521,6 @@
           </w:tcPr>
           <w:p>
             <w:pPr>
-              <w:pStyle w:val="Compact"/>
               <w:jc w:val="left"/>
             </w:pPr>
             <w:r>
@@ -4779,7 +4534,6 @@
           </w:tcPr>
           <w:p>
             <w:pPr>
-              <w:pStyle w:val="Compact"/>
               <w:jc w:val="left"/>
             </w:pPr>
             <w:r>
@@ -4805,7 +4559,6 @@
           </w:tcPr>
           <w:p>
             <w:pPr>
-              <w:pStyle w:val="Compact"/>
               <w:jc w:val="left"/>
             </w:pPr>
             <w:r>
@@ -4827,7 +4580,6 @@
           </w:tcPr>
           <w:p>
             <w:pPr>
-              <w:pStyle w:val="Compact"/>
               <w:jc w:val="left"/>
             </w:pPr>
             <w:r>
@@ -4841,7 +4593,6 @@
           </w:tcPr>
           <w:p>
             <w:pPr>
-              <w:pStyle w:val="Compact"/>
               <w:jc w:val="left"/>
             </w:pPr>
             <w:r>
@@ -4855,7 +4606,6 @@
           </w:tcPr>
           <w:p>
             <w:pPr>
-              <w:pStyle w:val="Compact"/>
               <w:jc w:val="left"/>
             </w:pPr>
             <w:r>
@@ -4875,7 +4625,6 @@
           </w:tcPr>
           <w:p>
             <w:pPr>
-              <w:pStyle w:val="Compact"/>
               <w:jc w:val="left"/>
             </w:pPr>
             <w:r>
@@ -4889,7 +4638,6 @@
           </w:tcPr>
           <w:p>
             <w:pPr>
-              <w:pStyle w:val="Compact"/>
               <w:jc w:val="left"/>
             </w:pPr>
             <w:r>
@@ -4911,7 +4659,6 @@
           </w:tcPr>
           <w:p>
             <w:pPr>
-              <w:pStyle w:val="Compact"/>
               <w:jc w:val="left"/>
             </w:pPr>
             <w:r>
@@ -4925,7 +4672,6 @@
           </w:tcPr>
           <w:p>
             <w:pPr>
-              <w:pStyle w:val="Compact"/>
               <w:jc w:val="left"/>
             </w:pPr>
             <w:r>
@@ -4939,7 +4685,6 @@
           </w:tcPr>
           <w:p>
             <w:pPr>
-              <w:pStyle w:val="Compact"/>
               <w:jc w:val="left"/>
             </w:pPr>
             <w:r>
@@ -4953,7 +4698,6 @@
           </w:tcPr>
           <w:p>
             <w:pPr>
-              <w:pStyle w:val="Compact"/>
               <w:jc w:val="left"/>
             </w:pPr>
             <w:r>
@@ -4967,7 +4711,6 @@
           </w:tcPr>
           <w:p>
             <w:pPr>
-              <w:pStyle w:val="Compact"/>
               <w:jc w:val="left"/>
             </w:pPr>
             <w:r>
@@ -5004,9 +4747,7 @@
       </w:r>
     </w:p>
     <w:p>
-      <w:pPr>
-        <w:pStyle w:val="FirstParagraph"/>
-      </w:pPr>
+      <w:pPr/>
       <w:r>
         <w:t xml:space="preserve">Electronegativity is an atom’s tendency to attract shared kinks</w:t>
       </w:r>
@@ -5036,9 +4777,7 @@
       </w:r>
     </w:p>
     <w:p>
-      <w:pPr>
-        <w:pStyle w:val="BodyText"/>
-      </w:pPr>
+      <w:pPr/>
       <w:r>
         <w:t xml:space="preserve">Fluorine (Z=9) is the most electronegative element. In rope language:</w:t>
       </w:r>
@@ -5123,9 +4862,7 @@
       </w:r>
     </w:p>
     <w:p>
-      <w:pPr>
-        <w:pStyle w:val="FirstParagraph"/>
-      </w:pPr>
+      <w:pPr/>
       <w:r>
         <w:t xml:space="preserve">The Pauling electronegativity χ (not to be confused with the chirality</w:t>
       </w:r>
@@ -5168,7 +4905,6 @@
           </w:tcPr>
           <w:p>
             <w:pPr>
-              <w:pStyle w:val="Compact"/>
               <w:jc w:val="left"/>
             </w:pPr>
             <w:r>
@@ -5186,7 +4922,6 @@
           </w:tcPr>
           <w:p>
             <w:pPr>
-              <w:pStyle w:val="Compact"/>
               <w:jc w:val="left"/>
             </w:pPr>
             <w:r>
@@ -5204,7 +4939,6 @@
           </w:tcPr>
           <w:p>
             <w:pPr>
-              <w:pStyle w:val="Compact"/>
               <w:jc w:val="left"/>
             </w:pPr>
             <w:r>
@@ -5236,7 +4970,6 @@
           </w:tcPr>
           <w:p>
             <w:pPr>
-              <w:pStyle w:val="Compact"/>
               <w:jc w:val="left"/>
             </w:pPr>
             <w:r>
@@ -5256,7 +4989,6 @@
           </w:tcPr>
           <w:p>
             <w:pPr>
-              <w:pStyle w:val="Compact"/>
               <w:jc w:val="left"/>
             </w:pPr>
             <w:r>
@@ -5270,7 +5002,6 @@
           </w:tcPr>
           <w:p>
             <w:pPr>
-              <w:pStyle w:val="Compact"/>
               <w:jc w:val="left"/>
             </w:pPr>
             <w:r>
@@ -5284,7 +5015,6 @@
           </w:tcPr>
           <w:p>
             <w:pPr>
-              <w:pStyle w:val="Compact"/>
               <w:jc w:val="left"/>
             </w:pPr>
             <w:r>
@@ -5298,7 +5028,6 @@
           </w:tcPr>
           <w:p>
             <w:pPr>
-              <w:pStyle w:val="Compact"/>
               <w:jc w:val="left"/>
             </w:pPr>
             <w:r>
@@ -5326,7 +5055,6 @@
           </w:tcPr>
           <w:p>
             <w:pPr>
-              <w:pStyle w:val="Compact"/>
               <w:jc w:val="left"/>
             </w:pPr>
             <w:r>
@@ -5340,7 +5068,6 @@
           </w:tcPr>
           <w:p>
             <w:pPr>
-              <w:pStyle w:val="Compact"/>
               <w:jc w:val="left"/>
             </w:pPr>
             <w:r>
@@ -5354,7 +5081,6 @@
           </w:tcPr>
           <w:p>
             <w:pPr>
-              <w:pStyle w:val="Compact"/>
               <w:jc w:val="left"/>
             </w:pPr>
             <w:r>
@@ -5368,7 +5094,6 @@
           </w:tcPr>
           <w:p>
             <w:pPr>
-              <w:pStyle w:val="Compact"/>
               <w:jc w:val="left"/>
             </w:pPr>
             <w:r>
@@ -5390,7 +5115,6 @@
           </w:tcPr>
           <w:p>
             <w:pPr>
-              <w:pStyle w:val="Compact"/>
               <w:jc w:val="left"/>
             </w:pPr>
             <w:r>
@@ -5404,7 +5128,6 @@
           </w:tcPr>
           <w:p>
             <w:pPr>
-              <w:pStyle w:val="Compact"/>
               <w:jc w:val="left"/>
             </w:pPr>
             <w:r>
@@ -5418,7 +5141,6 @@
           </w:tcPr>
           <w:p>
             <w:pPr>
-              <w:pStyle w:val="Compact"/>
               <w:jc w:val="left"/>
             </w:pPr>
             <w:r>
@@ -5432,7 +5154,6 @@
           </w:tcPr>
           <w:p>
             <w:pPr>
-              <w:pStyle w:val="Compact"/>
               <w:jc w:val="left"/>
             </w:pPr>
             <w:r>
@@ -5454,7 +5175,6 @@
           </w:tcPr>
           <w:p>
             <w:pPr>
-              <w:pStyle w:val="Compact"/>
               <w:jc w:val="left"/>
             </w:pPr>
             <w:r>
@@ -5468,7 +5188,6 @@
           </w:tcPr>
           <w:p>
             <w:pPr>
-              <w:pStyle w:val="Compact"/>
               <w:jc w:val="left"/>
             </w:pPr>
             <w:r>
@@ -5482,7 +5201,6 @@
           </w:tcPr>
           <w:p>
             <w:pPr>
-              <w:pStyle w:val="Compact"/>
               <w:jc w:val="left"/>
             </w:pPr>
             <w:r>
@@ -5496,7 +5214,6 @@
           </w:tcPr>
           <w:p>
             <w:pPr>
-              <w:pStyle w:val="Compact"/>
               <w:jc w:val="left"/>
             </w:pPr>
             <w:r>
@@ -5518,7 +5235,6 @@
           </w:tcPr>
           <w:p>
             <w:pPr>
-              <w:pStyle w:val="Compact"/>
               <w:jc w:val="left"/>
             </w:pPr>
             <w:r>
@@ -5532,7 +5248,6 @@
           </w:tcPr>
           <w:p>
             <w:pPr>
-              <w:pStyle w:val="Compact"/>
               <w:jc w:val="left"/>
             </w:pPr>
             <w:r>
@@ -5546,7 +5261,6 @@
           </w:tcPr>
           <w:p>
             <w:pPr>
-              <w:pStyle w:val="Compact"/>
               <w:jc w:val="left"/>
             </w:pPr>
             <w:r>
@@ -5560,7 +5274,6 @@
           </w:tcPr>
           <w:p>
             <w:pPr>
-              <w:pStyle w:val="Compact"/>
               <w:jc w:val="left"/>
             </w:pPr>
             <w:r>
@@ -5576,7 +5289,6 @@
           </w:tcPr>
           <w:p>
             <w:pPr>
-              <w:pStyle w:val="Compact"/>
               <w:jc w:val="left"/>
             </w:pPr>
             <w:r>
@@ -5590,7 +5302,6 @@
           </w:tcPr>
           <w:p>
             <w:pPr>
-              <w:pStyle w:val="Compact"/>
               <w:jc w:val="left"/>
             </w:pPr>
             <w:r>
@@ -5604,7 +5315,6 @@
           </w:tcPr>
           <w:p>
             <w:pPr>
-              <w:pStyle w:val="Compact"/>
               <w:jc w:val="left"/>
             </w:pPr>
             <w:r>
@@ -5618,7 +5328,6 @@
           </w:tcPr>
           <w:p>
             <w:pPr>
-              <w:pStyle w:val="Compact"/>
               <w:jc w:val="left"/>
             </w:pPr>
             <w:r>
@@ -5641,9 +5350,7 @@
       </w:tr>
     </w:tbl>
     <w:p>
-      <w:pPr>
-        <w:pStyle w:val="BodyText"/>
-      </w:pPr>
+      <w:pPr/>
       <w:r>
         <w:t xml:space="preserve">The trend across a period (left to right: electronegativity increases)</w:t>
       </w:r>
@@ -5689,9 +5396,7 @@
       </w:r>
     </w:p>
     <w:p>
-      <w:pPr>
-        <w:pStyle w:val="FirstParagraph"/>
-      </w:pPr>
+      <w:pPr/>
       <w:r>
         <w:t xml:space="preserve">The degree of rope mode asymmetry in a bond determines whether it is</w:t>
       </w:r>
@@ -5722,7 +5427,6 @@
           </w:tcPr>
           <w:p>
             <w:pPr>
-              <w:pStyle w:val="Compact"/>
               <w:jc w:val="left"/>
             </w:pPr>
             <w:r>
@@ -5740,7 +5444,6 @@
           </w:tcPr>
           <w:p>
             <w:pPr>
-              <w:pStyle w:val="Compact"/>
               <w:jc w:val="left"/>
             </w:pPr>
             <w:r>
@@ -5772,7 +5475,6 @@
           </w:tcPr>
           <w:p>
             <w:pPr>
-              <w:pStyle w:val="Compact"/>
               <w:jc w:val="left"/>
             </w:pPr>
             <w:r>
@@ -5790,7 +5492,6 @@
           </w:tcPr>
           <w:p>
             <w:pPr>
-              <w:pStyle w:val="Compact"/>
               <w:jc w:val="left"/>
             </w:pPr>
             <w:r>
@@ -5810,7 +5511,6 @@
           </w:tcPr>
           <w:p>
             <w:pPr>
-              <w:pStyle w:val="Compact"/>
               <w:jc w:val="left"/>
             </w:pPr>
             <w:r>
@@ -5830,7 +5530,6 @@
           </w:tcPr>
           <w:p>
             <w:pPr>
-              <w:pStyle w:val="Compact"/>
               <w:jc w:val="left"/>
             </w:pPr>
             <w:r>
@@ -5844,7 +5543,6 @@
           </w:tcPr>
           <w:p>
             <w:pPr>
-              <w:pStyle w:val="Compact"/>
               <w:jc w:val="left"/>
             </w:pPr>
             <w:r>
@@ -5870,7 +5568,6 @@
           </w:tcPr>
           <w:p>
             <w:pPr>
-              <w:pStyle w:val="Compact"/>
               <w:jc w:val="left"/>
             </w:pPr>
             <w:r>
@@ -5886,7 +5583,6 @@
           </w:tcPr>
           <w:p>
             <w:pPr>
-              <w:pStyle w:val="Compact"/>
               <w:jc w:val="left"/>
             </w:pPr>
             <w:r>
@@ -5906,7 +5602,6 @@
           </w:tcPr>
           <w:p>
             <w:pPr>
-              <w:pStyle w:val="Compact"/>
               <w:jc w:val="left"/>
             </w:pPr>
             <w:r>
@@ -5920,7 +5615,6 @@
           </w:tcPr>
           <w:p>
             <w:pPr>
-              <w:pStyle w:val="Compact"/>
               <w:jc w:val="left"/>
             </w:pPr>
             <w:r>
@@ -5952,7 +5646,6 @@
           </w:tcPr>
           <w:p>
             <w:pPr>
-              <w:pStyle w:val="Compact"/>
               <w:jc w:val="left"/>
             </w:pPr>
             <w:r>
@@ -5968,7 +5661,6 @@
           </w:tcPr>
           <w:p>
             <w:pPr>
-              <w:pStyle w:val="Compact"/>
               <w:jc w:val="left"/>
             </w:pPr>
             <w:r>
@@ -5982,7 +5674,6 @@
           </w:tcPr>
           <w:p>
             <w:pPr>
-              <w:pStyle w:val="Compact"/>
               <w:jc w:val="left"/>
             </w:pPr>
             <w:r>
@@ -5996,7 +5687,6 @@
           </w:tcPr>
           <w:p>
             <w:pPr>
-              <w:pStyle w:val="Compact"/>
               <w:jc w:val="left"/>
             </w:pPr>
             <w:r>
@@ -6022,7 +5712,6 @@
           </w:tcPr>
           <w:p>
             <w:pPr>
-              <w:pStyle w:val="Compact"/>
               <w:jc w:val="left"/>
             </w:pPr>
             <w:r>
@@ -6053,9 +5742,7 @@
       </w:r>
     </w:p>
     <w:p>
-      <w:pPr>
-        <w:pStyle w:val="FirstParagraph"/>
-      </w:pPr>
+      <w:pPr/>
       <w:r>
         <w:t xml:space="preserve">The Pauli exclusion principle states that no two fermions (particles</w:t>
       </w:r>
@@ -6129,9 +5816,7 @@
       </w:r>
     </w:p>
     <w:p>
-      <w:pPr>
-        <w:pStyle w:val="FirstParagraph"/>
-      </w:pPr>
+      <w:pPr/>
       <w:r>
         <w:t xml:space="preserve">Gaede’s framework has no account of Pauli exclusion. This is the single</w:t>
       </w:r>
@@ -6153,9 +5838,7 @@
       </w:r>
     </w:p>
     <w:p>
-      <w:pPr>
-        <w:pStyle w:val="FirstParagraph"/>
-      </w:pPr>
+      <w:pPr/>
       <w:r>
         <w:t xml:space="preserve">In the Bohmian rope picture developed in the light paper, electrons are</w:t>
       </w:r>
@@ -6179,9 +5862,7 @@
       </w:r>
     </w:p>
     <w:p>
-      <w:pPr>
-        <w:pStyle w:val="BodyText"/>
-      </w:pPr>
+      <w:pPr/>
       <w:r>
         <w:t xml:space="preserve">A rope mode (orbital) is a standing wave pattern with a specific</w:t>
       </w:r>
@@ -6199,9 +5880,7 @@
       </w:r>
     </w:p>
     <w:p>
-      <w:pPr>
-        <w:pStyle w:val="BodyText"/>
-      </w:pPr>
+      <w:pPr/>
       <w:r>
         <w:t xml:space="preserve">A rope mode can carry at most two kinks, one with rope-spin +ℏ/2 and one</w:t>
       </w:r>
@@ -6237,9 +5916,7 @@
       </w:r>
     </w:p>
     <w:p>
-      <w:pPr>
-        <w:pStyle w:val="BodyText"/>
-      </w:pPr>
+      <w:pPr/>
       <w:r>
         <w:t xml:space="preserve">Formally: the rope mode angular momentum is quantised in half-integer</w:t>
       </w:r>
@@ -6275,9 +5952,7 @@
       </w:r>
     </w:p>
     <w:p>
-      <w:pPr>
-        <w:pStyle w:val="BodyText"/>
-      </w:pPr>
+      <w:pPr/>
       <w:r>
         <w:t xml:space="preserve">This is the rope analogue of the antisymmetry requirement for fermions</w:t>
       </w:r>
@@ -6295,9 +5970,7 @@
       </w:r>
     </w:p>
     <w:p>
-      <w:pPr>
-        <w:pStyle w:val="BodyText"/>
-      </w:pPr>
+      <w:pPr/>
       <w:r>
         <w:t xml:space="preserve">Status: this argument is physically motivated and structurally</w:t>
       </w:r>
@@ -6359,17 +6032,13 @@
       </w:r>
     </w:p>
     <w:p>
-      <w:pPr>
-        <w:pStyle w:val="FirstParagraph"/>
-      </w:pPr>
+      <w:pPr/>
       <w:r>
         <w:t>Hydrogen bonding is a weak attractive interaction between a hydrogen atom covalently bonded to an electronegative atom (N, O, F) and a lone pair on another electronegative atom. It is responsible for water being liquid at room temperature, DNA base pairing, and protein secondary structure. This is a computed, benchmarked result rather than a description: assembling the derived electrostatics of winding imbalances with the molecular shapes of the geometry section and the adopted electronegativity scale yields the water-dimer bond at roughly −0.15 eV against a measured −0.22, sitting between thermal and covalent energies, preferring the linear geometry softly, and collapsing by over a hundredfold for a carbon-like donor — so the framework derives, in structure, why hydrogen uniquely does this. The one remaining empirical input is the nonbonded contact distance.</w:t>
       </w:r>
     </w:p>
     <w:p>
-      <w:pPr>
-        <w:pStyle w:val="BodyText"/>
-      </w:pPr>
+      <w:pPr/>
       <w:r>
         <w:t xml:space="preserve">In rope language: the H atom in an O–H bond has its bonding mode</w:t>
       </w:r>
@@ -6427,17 +6096,13 @@
       </w:r>
     </w:p>
     <w:p>
-      <w:pPr>
-        <w:pStyle w:val="FirstParagraph"/>
-      </w:pPr>
+      <w:pPr/>
       <w:r>
         <w:t>In metals (Na, Cu, Fe), the valence electrons are not localised in bonds between specific atom pairs. Instead, they are delocalised across the entire metal lattice. This delocalisation is a computed result: many-centre mode sharing forms a classical coupled-oscillator band whose non-saturation is derived — binding grows with coordination as the square root of the neighbour count while the per-contact strength falls, which is the fractional metallic bond — and whose empty-shell-diffuse versus full-shell-compact character separates the alkali metals from the molecular halogens structurally. Cohesive energies come out at the right order untuned, and conduction follows for free: the delocalised excitations are mobile windings, whose transport is the screw current of the magnetism sector, so the metal/insulator distinction rides the same band filling.</w:t>
       </w:r>
     </w:p>
     <w:p>
-      <w:pPr>
-        <w:pStyle w:val="BodyText"/>
-      </w:pPr>
+      <w:pPr/>
       <w:r>
         <w:t xml:space="preserve">In rope language: this is the tension wave picture of current (from the</w:t>
       </w:r>
@@ -6501,17 +6166,13 @@
       </w:r>
     </w:p>
     <w:p>
-      <w:pPr>
-        <w:pStyle w:val="FirstParagraph"/>
-      </w:pPr>
+      <w:pPr/>
       <w:r>
         <w:t>Van der Waals interactions are weak attractions between temporarily induced dipoles in adjacent molecules. In rope language: thermal fluctuations create temporary asymmetries in the rope mode density of one molecule (a temporary Tᵏᵉᵗ imbalance), which induces a complementary asymmetry in adjacent molecules through the rope tension field. The resulting synchronised fluctuations create a net attractive tension gradient. One boundary must be stated plainly: this thermal-fluctuation account covers only the classical, temperature-dependent part of the interaction and would wrongly predict it vanishing at absolute zero. True London dispersion persists at zero temperature and scales with the quantum of action; it is a zero-point effect, and therefore sits at the same declared quantum boundary as the helium-4 binding failure, outside what the classical rope picture derives.</w:t>
       </w:r>
     </w:p>
     <w:p>
-      <w:pPr>
-        <w:pStyle w:val="BodyText"/>
-      </w:pPr>
+      <w:pPr/>
       <w:r>
         <w:t xml:space="preserve">π-stacking (the interaction between aromatic rings in DNA base pairs and</w:t>
       </w:r>
@@ -6570,7 +6231,6 @@
           </w:tcPr>
           <w:p>
             <w:pPr>
-              <w:pStyle w:val="Compact"/>
               <w:jc w:val="left"/>
             </w:pPr>
             <w:r>
@@ -6588,7 +6248,6 @@
           </w:tcPr>
           <w:p>
             <w:pPr>
-              <w:pStyle w:val="Compact"/>
               <w:jc w:val="left"/>
             </w:pPr>
             <w:r>
@@ -6620,7 +6279,6 @@
           </w:tcPr>
           <w:p>
             <w:pPr>
-              <w:pStyle w:val="Compact"/>
               <w:jc w:val="left"/>
             </w:pPr>
             <w:r>
@@ -6640,7 +6298,6 @@
           </w:tcPr>
           <w:p>
             <w:pPr>
-              <w:pStyle w:val="Compact"/>
               <w:jc w:val="left"/>
             </w:pPr>
             <w:r>
@@ -6654,7 +6311,6 @@
           </w:tcPr>
           <w:p>
             <w:pPr>
-              <w:pStyle w:val="Compact"/>
               <w:jc w:val="left"/>
             </w:pPr>
             <w:r>
@@ -6680,7 +6336,6 @@
           </w:tcPr>
           <w:p>
             <w:pPr>
-              <w:pStyle w:val="Compact"/>
               <w:jc w:val="left"/>
             </w:pPr>
             <w:r>
@@ -6714,7 +6369,6 @@
           </w:tcPr>
           <w:p>
             <w:pPr>
-              <w:pStyle w:val="Compact"/>
               <w:jc w:val="left"/>
             </w:pPr>
             <w:r>
@@ -6728,7 +6382,6 @@
           </w:tcPr>
           <w:p>
             <w:pPr>
-              <w:pStyle w:val="Compact"/>
               <w:jc w:val="left"/>
             </w:pPr>
             <w:r>
@@ -6754,7 +6407,6 @@
           </w:tcPr>
           <w:p>
             <w:pPr>
-              <w:pStyle w:val="Compact"/>
               <w:jc w:val="left"/>
             </w:pPr>
             <w:r>
@@ -6788,7 +6440,6 @@
           </w:tcPr>
           <w:p>
             <w:pPr>
-              <w:pStyle w:val="Compact"/>
               <w:jc w:val="left"/>
             </w:pPr>
             <w:r>
@@ -6808,7 +6459,6 @@
           </w:tcPr>
           <w:p>
             <w:pPr>
-              <w:pStyle w:val="Compact"/>
               <w:jc w:val="left"/>
             </w:pPr>
             <w:r>
@@ -6828,7 +6478,6 @@
           </w:tcPr>
           <w:p>
             <w:pPr>
-              <w:pStyle w:val="Compact"/>
               <w:jc w:val="left"/>
             </w:pPr>
             <w:r>
@@ -6862,7 +6511,6 @@
           </w:tcPr>
           <w:p>
             <w:pPr>
-              <w:pStyle w:val="Compact"/>
               <w:jc w:val="left"/>
             </w:pPr>
             <w:r>
@@ -6882,7 +6530,6 @@
           </w:tcPr>
           <w:p>
             <w:pPr>
-              <w:pStyle w:val="Compact"/>
               <w:jc w:val="left"/>
             </w:pPr>
             <w:r>
@@ -6902,7 +6549,6 @@
           </w:tcPr>
           <w:p>
             <w:pPr>
-              <w:pStyle w:val="Compact"/>
               <w:jc w:val="left"/>
             </w:pPr>
             <w:r>
@@ -6936,7 +6582,6 @@
           </w:tcPr>
           <w:p>
             <w:pPr>
-              <w:pStyle w:val="Compact"/>
               <w:jc w:val="left"/>
             </w:pPr>
             <w:r>
@@ -6956,7 +6601,6 @@
           </w:tcPr>
           <w:p>
             <w:pPr>
-              <w:pStyle w:val="Compact"/>
               <w:jc w:val="left"/>
             </w:pPr>
             <w:r>
@@ -6982,7 +6626,6 @@
           </w:tcPr>
           <w:p>
             <w:pPr>
-              <w:pStyle w:val="Compact"/>
               <w:jc w:val="left"/>
             </w:pPr>
             <w:r>
@@ -7010,7 +6653,6 @@
           </w:tcPr>
           <w:p>
             <w:pPr>
-              <w:pStyle w:val="Compact"/>
               <w:jc w:val="left"/>
             </w:pPr>
             <w:r>
@@ -7030,7 +6672,6 @@
           </w:tcPr>
           <w:p>
             <w:pPr>
-              <w:pStyle w:val="Compact"/>
               <w:jc w:val="left"/>
             </w:pPr>
             <w:r>
@@ -7050,7 +6691,6 @@
           </w:tcPr>
           <w:p>
             <w:pPr>
-              <w:pStyle w:val="Compact"/>
               <w:jc w:val="left"/>
             </w:pPr>
             <w:r>
@@ -7078,7 +6718,6 @@
           </w:tcPr>
           <w:p>
             <w:pPr>
-              <w:pStyle w:val="Compact"/>
               <w:jc w:val="left"/>
             </w:pPr>
             <w:r>
@@ -7098,7 +6737,6 @@
           </w:tcPr>
           <w:p>
             <w:pPr>
-              <w:pStyle w:val="Compact"/>
               <w:jc w:val="left"/>
             </w:pPr>
             <w:r>
@@ -7118,7 +6756,6 @@
           </w:tcPr>
           <w:p>
             <w:pPr>
-              <w:pStyle w:val="Compact"/>
               <w:jc w:val="left"/>
             </w:pPr>
             <w:r>
@@ -7152,7 +6789,6 @@
           </w:tcPr>
           <w:p>
             <w:pPr>
-              <w:pStyle w:val="Compact"/>
               <w:jc w:val="left"/>
             </w:pPr>
             <w:r>
@@ -7172,7 +6808,6 @@
           </w:tcPr>
           <w:p>
             <w:pPr>
-              <w:pStyle w:val="Compact"/>
               <w:jc w:val="left"/>
             </w:pPr>
             <w:r>
@@ -7192,7 +6827,6 @@
           </w:tcPr>
           <w:p>
             <w:pPr>
-              <w:pStyle w:val="Compact"/>
               <w:jc w:val="left"/>
             </w:pPr>
             <w:r>
@@ -7226,7 +6860,6 @@
           </w:tcPr>
           <w:p>
             <w:pPr>
-              <w:pStyle w:val="Compact"/>
               <w:jc w:val="left"/>
             </w:pPr>
             <w:r>
@@ -7246,7 +6879,6 @@
           </w:tcPr>
           <w:p>
             <w:pPr>
-              <w:pStyle w:val="Compact"/>
               <w:jc w:val="left"/>
             </w:pPr>
             <w:r>
@@ -7266,7 +6898,6 @@
           </w:tcPr>
           <w:p>
             <w:pPr>
-              <w:pStyle w:val="Compact"/>
               <w:jc w:val="left"/>
             </w:pPr>
             <w:r>
@@ -7300,7 +6931,6 @@
           </w:tcPr>
           <w:p>
             <w:pPr>
-              <w:pStyle w:val="Compact"/>
               <w:jc w:val="left"/>
             </w:pPr>
             <w:r>
@@ -7314,7 +6944,6 @@
           </w:tcPr>
           <w:p>
             <w:pPr>
-              <w:pStyle w:val="Compact"/>
               <w:jc w:val="left"/>
             </w:pPr>
             <w:r>
@@ -7334,7 +6963,6 @@
           </w:tcPr>
           <w:p>
             <w:pPr>
-              <w:pStyle w:val="Compact"/>
               <w:jc w:val="left"/>
             </w:pPr>
             <w:r>
@@ -7362,7 +6990,6 @@
           </w:tcPr>
           <w:p>
             <w:pPr>
-              <w:pStyle w:val="Compact"/>
               <w:jc w:val="left"/>
             </w:pPr>
             <w:r>
@@ -7382,7 +7009,6 @@
           </w:tcPr>
           <w:p>
             <w:pPr>
-              <w:pStyle w:val="Compact"/>
               <w:jc w:val="left"/>
             </w:pPr>
             <w:r>
@@ -7402,7 +7028,6 @@
           </w:tcPr>
           <w:p>
             <w:pPr>
-              <w:pStyle w:val="Compact"/>
               <w:jc w:val="left"/>
             </w:pPr>
             <w:r>
@@ -7435,23 +7060,9 @@
       </w:r>
     </w:p>
     <w:p>
-      <w:pPr>
-        <w:pStyle w:val="FirstParagraph"/>
-      </w:pPr>
-      <w:r>
-        <w:t xml:space="preserve">We have extended the Rope Hypothesis into chemistry, correcting Gaede’s</w:t>
-      </w:r>
-      <w:r>
-        <w:t xml:space="preserve"> </w:t>
-      </w:r>
-      <w:r>
-        <w:t xml:space="preserve">original errors and building a systematic account of atomic structure,</w:t>
-      </w:r>
-      <w:r>
-        <w:t xml:space="preserve"> </w:t>
-      </w:r>
-      <w:r>
-        <w:t xml:space="preserve">bonding, and molecular geometry. The main findings are:</w:t>
+      <w:pPr/>
+      <w:r>
+        <w:t>We have extended the Rope Hypothesis into chemistry, modifying Gaede’s original claims where observation requires, and building a systematic account of atomic structure, bonding, and molecular geometry. The main findings are:</w:t>
       </w:r>
     </w:p>
     <w:p>
@@ -7762,9 +7373,7 @@
       </w:r>
     </w:p>
     <w:p>
-      <w:pPr>
-        <w:pStyle w:val="FirstParagraph"/>
-      </w:pPr>
+      <w:pPr/>
       <w:r>
         <w:t xml:space="preserve">The honest assessment: rope chemistry is quantum chemistry given a</w:t>
       </w:r>
@@ -7803,9 +7412,7 @@
       </w:r>
     </w:p>
     <w:p>
-      <w:pPr>
-        <w:pStyle w:val="BodyText"/>
-      </w:pPr>
+      <w:pPr/>
       <w:r>
         <w:t xml:space="preserve">The rope model does not currently make new quantitative predictions in</w:t>
       </w:r>
@@ -7871,9 +7478,7 @@
       </w:r>
     </w:p>
     <w:p>
-      <w:pPr>
-        <w:pStyle w:val="BodyText"/>
-      </w:pPr>
+      <w:pPr/>
       <w:r>
         <w:t xml:space="preserve">The path from rope chemistry to new practical applications runs through</w:t>
       </w:r>
@@ -7919,9 +7524,7 @@
       </w:r>
     </w:p>
     <w:p>
-      <w:pPr>
-        <w:pStyle w:val="FirstParagraph"/>
-      </w:pPr>
+      <w:pPr/>
       <w:r>
         <w:t xml:space="preserve">We summarise the solution to equation (1) in spherical coordinates (r,</w:t>
       </w:r>
@@ -7939,25 +7542,19 @@
       </w:r>
     </w:p>
     <w:p>
-      <w:pPr>
-        <w:pStyle w:val="BodyText"/>
-      </w:pPr>
+      <w:pPr/>
       <w:r>
         <w:t xml:space="preserve">The rope wave ψ(r, θ, φ) separates into radial and angular parts:</w:t>
       </w:r>
     </w:p>
     <w:p>
-      <w:pPr>
-        <w:pStyle w:val="BodyText"/>
-      </w:pPr>
+      <w:pPr/>
       <w:r>
         <w:t xml:space="preserve">ψₙₗₘ(r, θ, φ) = Rₙₗ(r) × Yₗₘ(θ, φ) (A1)</w:t>
       </w:r>
     </w:p>
     <w:p>
-      <w:pPr>
-        <w:pStyle w:val="BodyText"/>
-      </w:pPr>
+      <w:pPr/>
       <w:r>
         <w:t xml:space="preserve">where Rₙₗ(r) is the radial mode function and Yₗₘ(θ, φ) are the spherical</w:t>
       </w:r>
@@ -8002,41 +7599,31 @@
       </w:r>
     </w:p>
     <w:p>
-      <w:pPr>
-        <w:pStyle w:val="FirstParagraph"/>
-      </w:pPr>
+      <w:pPr/>
       <w:r>
         <w:t xml:space="preserve">The radial mode functions for hydrogen (Z=1):</w:t>
       </w:r>
     </w:p>
     <w:p>
-      <w:pPr>
-        <w:pStyle w:val="BodyText"/>
-      </w:pPr>
+      <w:pPr/>
       <w:r>
         <w:t xml:space="preserve">R₁₀(r) = 2(a₀)⁻³ᐟ² exp(−r/a₀) (1s mode) (A2)</w:t>
       </w:r>
     </w:p>
     <w:p>
-      <w:pPr>
-        <w:pStyle w:val="BodyText"/>
-      </w:pPr>
+      <w:pPr/>
       <w:r>
         <w:t xml:space="preserve">R₂₀(r) = (2a₀)⁻³ᐟ² (1 − r/2a₀) exp(−r/2a₀) (2s mode) (A3)</w:t>
       </w:r>
     </w:p>
     <w:p>
-      <w:pPr>
-        <w:pStyle w:val="BodyText"/>
-      </w:pPr>
+      <w:pPr/>
       <w:r>
         <w:t xml:space="preserve">R₂₁(r) = (2a₀)⁻³ᐟ² (r/2a₀√3) exp(−r/2a₀) (2p mode) (A4)</w:t>
       </w:r>
     </w:p>
     <w:p>
-      <w:pPr>
-        <w:pStyle w:val="BodyText"/>
-      </w:pPr>
+      <w:pPr/>
       <w:r>
         <w:t xml:space="preserve">where a₀ = 0.529 Å is the Bohr radius — the most probable distance for</w:t>
       </w:r>
@@ -8076,25 +7663,19 @@
       </w:r>
     </w:p>
     <w:p>
-      <w:pPr>
-        <w:pStyle w:val="FirstParagraph"/>
-      </w:pPr>
+      <w:pPr/>
       <w:r>
         <w:t xml:space="preserve">Bohr, N. 1913, Philosophical Magazine, 26, 1–25</w:t>
       </w:r>
     </w:p>
     <w:p>
-      <w:pPr>
-        <w:pStyle w:val="BodyText"/>
-      </w:pPr>
+      <w:pPr/>
       <w:r>
         <w:t xml:space="preserve">de Broglie, L. 1924, PhD Thesis, University of Paris</w:t>
       </w:r>
     </w:p>
     <w:p>
-      <w:pPr>
-        <w:pStyle w:val="BodyText"/>
-      </w:pPr>
+      <w:pPr/>
       <w:r>
         <w:t xml:space="preserve">Gaede, B. 2014, The Rope Hypothesis, Science 342 (self-published,</w:t>
       </w:r>
@@ -8106,33 +7687,25 @@
       </w:r>
     </w:p>
     <w:p>
-      <w:pPr>
-        <w:pStyle w:val="BodyText"/>
-      </w:pPr>
+      <w:pPr/>
       <w:r>
         <w:t xml:space="preserve">Gaede, B. 2020, The Rope Hypothesis. Internet Archive (self-published)</w:t>
       </w:r>
     </w:p>
     <w:p>
-      <w:pPr>
-        <w:pStyle w:val="BodyText"/>
-      </w:pPr>
+      <w:pPr/>
       <w:r>
         <w:t xml:space="preserve">Heitler, W. &amp; London, F. 1927, Zeitschrift für Physik, 44, 455</w:t>
       </w:r>
     </w:p>
     <w:p>
-      <w:pPr>
-        <w:pStyle w:val="BodyText"/>
-      </w:pPr>
+      <w:pPr/>
       <w:r>
         <w:t xml:space="preserve">Lewis, G.N. 1916, Journal of the American Chemical Society, 38, 762</w:t>
       </w:r>
     </w:p>
     <w:p>
-      <w:pPr>
-        <w:pStyle w:val="BodyText"/>
-      </w:pPr>
+      <w:pPr/>
       <w:r>
         <w:t xml:space="preserve">Linus Pauling 1931, Journal of the American Chemical Society, 53, 1367</w:t>
       </w:r>
@@ -8144,17 +7717,13 @@
       </w:r>
     </w:p>
     <w:p>
-      <w:pPr>
-        <w:pStyle w:val="BodyText"/>
-      </w:pPr>
+      <w:pPr/>
       <w:r>
         <w:t xml:space="preserve">Pauli, W. 1925, Zeitschrift für Physik, 31, 765</w:t>
       </w:r>
     </w:p>
     <w:p>
-      <w:pPr>
-        <w:pStyle w:val="BodyText"/>
-      </w:pPr>
+      <w:pPr/>
       <w:r>
         <w:t xml:space="preserve">Palmer, M. &amp; Claude 2026a, Gravity in the Rope Framework (preprint,</w:t>
       </w:r>
@@ -8166,9 +7735,7 @@
       </w:r>
     </w:p>
     <w:p>
-      <w:pPr>
-        <w:pStyle w:val="BodyText"/>
-      </w:pPr>
+      <w:pPr/>
       <w:r>
         <w:t xml:space="preserve">Palmer, M. &amp; Claude 2026b, Magnetism in the Rope Framework (working</w:t>
       </w:r>
@@ -8180,17 +7747,13 @@
       </w:r>
     </w:p>
     <w:p>
-      <w:pPr>
-        <w:pStyle w:val="BodyText"/>
-      </w:pPr>
+      <w:pPr/>
       <w:r>
         <w:t xml:space="preserve">Palmer, M. &amp; Claude 2026c, Light in the Rope Framework (working paper)</w:t>
       </w:r>
     </w:p>
     <w:p>
-      <w:pPr>
-        <w:pStyle w:val="BodyText"/>
-      </w:pPr>
+      <w:pPr/>
       <w:r>
         <w:t xml:space="preserve">Palmer, M. &amp; Claude 2026d, Electricity in the Rope Framework (working</w:t>
       </w:r>
@@ -8202,17 +7765,13 @@
       </w:r>
     </w:p>
     <w:p>
-      <w:pPr>
-        <w:pStyle w:val="BodyText"/>
-      </w:pPr>
+      <w:pPr/>
       <w:r>
         <w:t xml:space="preserve">Schrödinger, E. 1926, Annalen der Physik, 79, 361</w:t>
       </w:r>
     </w:p>
     <w:p>
-      <w:pPr>
-        <w:pStyle w:val="BodyText"/>
-      </w:pPr>
+      <w:pPr/>
       <w:r>
         <w:t xml:space="preserve">VSEPR: Gillespie, R.J. &amp; Nyholm, R.S. 1957, Quarterly Reviews of the</w:t>
       </w:r>
@@ -8224,9 +7783,7 @@
       </w:r>
     </w:p>
     <w:p>
-      <w:pPr>
-        <w:pStyle w:val="BodyText"/>
-      </w:pPr>
+      <w:pPr/>
       <w:r>
         <w:t xml:space="preserve">Disclosure: This paper was produced through extended scientific</w:t>
       </w:r>
@@ -8256,9 +7813,7 @@
       </w:r>
     </w:p>
     <w:p>
-      <w:pPr>
-        <w:pStyle w:val="BodyText"/>
-      </w:pPr>
+      <w:pPr/>
       <w:r>
         <w:rPr>
           <w:b/>
@@ -8267,9 +7822,7 @@
       </w:r>
     </w:p>
     <w:p>
-      <w:pPr>
-        <w:pStyle w:val="BodyText"/>
-      </w:pPr>
+      <w:pPr/>
       <w:r>
         <w:t xml:space="preserve">The mode-overlap functional constructed from the network primitives</w:t>
       </w:r>
@@ -8305,9 +7858,7 @@
       </w:r>
     </w:p>
     <w:p>
-      <w:pPr>
-        <w:pStyle w:val="BodyText"/>
-      </w:pPr>
+      <w:pPr/>
       <w:r>
         <w:rPr>
           <w:iCs/>
@@ -8359,9 +7910,7 @@
       </w:r>
     </w:p>
     <w:p>
-      <w:pPr>
-        <w:pStyle w:val="BodyText"/>
-      </w:pPr>
+      <w:pPr/>
       <w:r>
         <w:rPr>
           <w:iCs/>
@@ -8469,6 +8018,11 @@
     </w:p>
     <w:p>
       <w:r>
+        <w:t xml:space="preserve">FIELD-LEVEL CONFIRMATION (CHEM-DYN-002). The barrier results above were first derived with exponential-hopping stand-in amplitudes; the frozen mode-overlap functional has now been evaluated along the same exchange coordinate, with the amplitude shape computed from grid integrals of the declared profiles and everything else inherited unchanged. The barrier survives: +0.0122 De coherent (vs the ansatz's 0.0142; the field shape's heavier tail slightly lowers it), saddle exactly symmetric, incoherent limit 0.502, the parameter-free bracket still containing the measured 0.0885 (log-midpoint 0.078, recorded as observation only), and Hammond's early transition state emerging from computed amplitudes. Barrier existence is thus a property of the derived functional, not the stand-in. The coherence fraction remains the registered next step; rates and tunneling belong to the quantum-kinetic layer. Benchmark: benchmarks/em/reaction_dynamics_field_level.py.</w:t>
+      </w:r>
+    </w:p>
+    <w:p>
+      <w:r>
         <w:rPr>
           <w:b/>
         </w:rPr>
@@ -8489,6 +8043,14 @@
       </w:r>
       <w:r>
         <w:t>OPEN  [benchmark: benchmarks/em/reaction_dynamics_foundations.py]</w:t>
+      </w:r>
+    </w:p>
+    <w:p>
+      <w:r>
+        <w:rPr>
+          <w:b/>
+        </w:rPr>
+        <w:t xml:space="preserve">• CHEM-DYN-002 [Modeled]: Field-level barrier confirmation -- the ansatz survives the derived functional  [benchmark: benchmarks/em/reaction_dynamics_field_level.py]</w:t>
       </w:r>
     </w:p>
     <w:p>

</xml_diff>

<commit_message>
updated rope theory of chemistry source paper
CHEM-DYN-003: the field-level reaction-dynamics program completed
</commit_message>
<xml_diff>
--- a/papers/_sources/rope_theory_of_chemistry.docx
+++ b/papers/_sources/rope_theory_of_chemistry.docx
@@ -8023,6 +8023,11 @@
     </w:p>
     <w:p>
       <w:r>
+        <w:t xml:space="preserve">CATALYSIS, HAMMOND, AND BELL–EVANS–POLANYI (CHEM-DYN-003). The field-level program closes with three structural results. The catalysis shape-independence is now exact and derived: the capacity-donation barrier depends only on the reachable amplitude range, so field amplitudes reproduce the analytic 1−(1+κ)²/8 to four decimals at every κ. Hammond's postulate emerges as a THRESHOLD: the thermoneutral saddle is symmetric, and any appreciable exothermicity pushes the transition state maximally early. And the Bell–Evans–Polanyi correlation holds with its extreme reported straight: in the coherent two-channel surface, exothermic steps are barrierless — the barrier belongs to the thermoneutral exchange — with the reverse barrier tracking endothermicity exactly. The honest caveat is stated in the claim: this surface lacks the entrance-channel contact structure that gives real exothermic reactions their small barriers; the model captures the direction and the extreme, not asymmetric barrier magnitudes. Benchmark: benchmarks/em/reaction_dynamics_catalysis.py.</w:t>
+      </w:r>
+    </w:p>
+    <w:p>
+      <w:r>
         <w:rPr>
           <w:b/>
         </w:rPr>
@@ -8051,6 +8056,14 @@
           <w:b/>
         </w:rPr>
         <w:t xml:space="preserve">• CHEM-DYN-002 [Modeled]: Field-level barrier confirmation -- the ansatz survives the derived functional  [benchmark: benchmarks/em/reaction_dynamics_field_level.py]</w:t>
+      </w:r>
+    </w:p>
+    <w:p>
+      <w:r>
+        <w:rPr>
+          <w:b/>
+        </w:rPr>
+        <w:t xml:space="preserve">• CHEM-DYN-003 [Modeled]: Catalysis invariance exact; Hammond threshold; BEP extreme  [benchmark: benchmarks/em/reaction_dynamics_catalysis.py]</w:t>
       </w:r>
     </w:p>
     <w:p>

</xml_diff>